<commit_message>
Remove portfolio line from CV header
Co-Authored-By: Claude Opus 5.5 <noreply@anthropic.com>
Claude-Session: https://claude.ai/code/session_016tqYLH53EDTis7uwvwUsAJ
</commit_message>
<xml_diff>
--- a/cv/Prama_Putra_CV_Data.docx
+++ b/cv/Prama_Putra_CV_Data.docx
@@ -36,7 +36,7 @@
     </w:p>
     <w:p>
       <w:pPr>
-        <w:spacing w:after="0"/>
+        <w:spacing w:after="60"/>
         <w:jc w:val="center"/>
       </w:pPr>
       <w:r>
@@ -47,7 +47,7 @@
         </w:rPr>
         <w:t xml:space="preserve">Kuala Lumpur, Malaysia (GMT+8)  |  </w:t>
       </w:r>
-      <w:hyperlink w:history="1" r:id="rIdcrtcfpv38r31xgdlxug1g">
+      <w:hyperlink w:history="1" r:id="rIdzzvbe6dzr9kjmakzgzob5">
         <w:r>
           <w:rPr>
             <w:rFonts w:ascii="Calibri" w:cs="Calibri" w:eastAsia="Calibri" w:hAnsi="Calibri"/>
@@ -67,7 +67,7 @@
         </w:rPr>
         <w:t xml:space="preserve">  |  </w:t>
       </w:r>
-      <w:hyperlink w:history="1" r:id="rId7c_ohzw5m1chrg5r_rfva">
+      <w:hyperlink w:history="1" r:id="rIdjvo5fy2giu3cxagbe313l">
         <w:r>
           <w:rPr>
             <w:rFonts w:ascii="Calibri" w:cs="Calibri" w:eastAsia="Calibri" w:hAnsi="Calibri"/>
@@ -87,7 +87,7 @@
         </w:rPr>
         <w:t xml:space="preserve">  |  </w:t>
       </w:r>
-      <w:hyperlink w:history="1" r:id="rIdifdh2edf5hnirvhjtilqx">
+      <w:hyperlink w:history="1" r:id="rId7fr6ywzlumuatdg1lkp20">
         <w:r>
           <w:rPr>
             <w:rFonts w:ascii="Calibri" w:cs="Calibri" w:eastAsia="Calibri" w:hAnsi="Calibri"/>
@@ -102,32 +102,6 @@
     </w:p>
     <w:p>
       <w:pPr>
-        <w:spacing w:after="60"/>
-        <w:jc w:val="center"/>
-      </w:pPr>
-      <w:r>
-        <w:rPr>
-          <w:rFonts w:ascii="Calibri" w:cs="Calibri" w:eastAsia="Calibri" w:hAnsi="Calibri"/>
-          <w:b/>
-          <w:bCs/>
-          <w:sz w:val="18"/>
-          <w:szCs w:val="18"/>
-        </w:rPr>
-        <w:t xml:space="preserve">Portfolio: </w:t>
-      </w:r>
-      <w:r>
-        <w:rPr>
-          <w:rFonts w:ascii="Calibri" w:cs="Calibri" w:eastAsia="Calibri" w:hAnsi="Calibri"/>
-          <w:sz w:val="18"/>
-          <w:szCs w:val="18"/>
-          <w:highlight w:val="yellow"/>
-          <w:highlightCs w:val="yellow"/>
-        </w:rPr>
-        <w:t xml:space="preserve">[paste your Behance / Google Drive portfolio link]</w:t>
-      </w:r>
-    </w:p>
-    <w:p>
-      <w:pPr>
         <w:pBdr>
           <w:bottom w:val="single" w:color="1F3A5F" w:sz="6" w:space="1"/>
         </w:pBdr>
@@ -859,7 +833,7 @@
         </w:rPr>
         <w:t xml:space="preserve">  |  Tempat Belajar, Aug 2024 – Jan 2025  </w:t>
       </w:r>
-      <w:hyperlink w:history="1" r:id="rIdbcr8a3ya_9z9j3othuucb">
+      <w:hyperlink w:history="1" r:id="rIdwny4ne8z5c6yjxrxgyjkx">
         <w:r>
           <w:rPr>
             <w:rFonts w:ascii="Calibri" w:cs="Calibri" w:eastAsia="Calibri" w:hAnsi="Calibri"/>
@@ -894,7 +868,7 @@
         </w:rPr>
         <w:t xml:space="preserve">  |  Overall Band 6.5  </w:t>
       </w:r>
-      <w:hyperlink w:history="1" r:id="rIdl5bmkvjvx8jss4a-r3nne">
+      <w:hyperlink w:history="1" r:id="rId8iuql30aw4mdordkeyrvg">
         <w:r>
           <w:rPr>
             <w:rFonts w:ascii="Calibri" w:cs="Calibri" w:eastAsia="Calibri" w:hAnsi="Calibri"/>

</xml_diff>

<commit_message>
Fill in CV details and add application pack for 48 jobs
Co-Authored-By: Claude Opus 5.5 <noreply@anthropic.com>
Claude-Session: https://claude.ai/code/session_016tqYLH53EDTis7uwvwUsAJ
</commit_message>
<xml_diff>
--- a/cv/Prama_Putra_CV_Data.docx
+++ b/cv/Prama_Putra_CV_Data.docx
@@ -47,7 +47,7 @@
         </w:rPr>
         <w:t xml:space="preserve">Kuala Lumpur, Malaysia (GMT+8)  |  </w:t>
       </w:r>
-      <w:hyperlink w:history="1" r:id="rIdzzvbe6dzr9kjmakzgzob5">
+      <w:hyperlink w:history="1" r:id="rIdv_pika34zyvw1cgj-tfih">
         <w:r>
           <w:rPr>
             <w:rFonts w:ascii="Calibri" w:cs="Calibri" w:eastAsia="Calibri" w:hAnsi="Calibri"/>
@@ -67,7 +67,7 @@
         </w:rPr>
         <w:t xml:space="preserve">  |  </w:t>
       </w:r>
-      <w:hyperlink w:history="1" r:id="rIdjvo5fy2giu3cxagbe313l">
+      <w:hyperlink w:history="1" r:id="rId_pqhq4u5krh7njl-t9bij">
         <w:r>
           <w:rPr>
             <w:rFonts w:ascii="Calibri" w:cs="Calibri" w:eastAsia="Calibri" w:hAnsi="Calibri"/>
@@ -87,7 +87,7 @@
         </w:rPr>
         <w:t xml:space="preserve">  |  </w:t>
       </w:r>
-      <w:hyperlink w:history="1" r:id="rId7fr6ywzlumuatdg1lkp20">
+      <w:hyperlink w:history="1" r:id="rId3chqevpgtbzq3fuphn1-h">
         <w:r>
           <w:rPr>
             <w:rFonts w:ascii="Calibri" w:cs="Calibri" w:eastAsia="Calibri" w:hAnsi="Calibri"/>
@@ -129,25 +129,7 @@
           <w:sz w:val="21"/>
           <w:szCs w:val="21"/>
         </w:rPr>
-        <w:t xml:space="preserve">Data Science undergraduate at UCSI University with a RevoU data analytics virtual internship. Detail-oriented and trilingual (Indonesian native, English IELTS 6.5, Arabic), with experience turning information into clear visuals and content. Looking for remote part-time work in data annotation, AI training and evaluation, data entry or junior data analysis, </w:t>
-      </w:r>
-      <w:r>
-        <w:rPr>
-          <w:rFonts w:ascii="Calibri" w:cs="Calibri" w:eastAsia="Calibri" w:hAnsi="Calibri"/>
-          <w:sz w:val="21"/>
-          <w:szCs w:val="21"/>
-          <w:highlight w:val="yellow"/>
-          <w:highlightCs w:val="yellow"/>
-        </w:rPr>
-        <w:t xml:space="preserve">[X]</w:t>
-      </w:r>
-      <w:r>
-        <w:rPr>
-          <w:rFonts w:ascii="Calibri" w:cs="Calibri" w:eastAsia="Calibri" w:hAnsi="Calibri"/>
-          <w:sz w:val="21"/>
-          <w:szCs w:val="21"/>
-        </w:rPr>
-        <w:t xml:space="preserve"> hours per week.</w:t>
+        <w:t xml:space="preserve">Data Science undergraduate at UCSI University with a RevoU data analytics virtual internship. Detail-oriented and trilingual (Indonesian native, English IELTS 6.5, conversational Arabic), working with Python (Google Colab), Tableau and Excel. Looking for remote part-time work in data annotation, AI training and evaluation, data entry or junior data analysis, 20–30 hours per week.</w:t>
       </w:r>
     </w:p>
     <w:p>
@@ -188,10 +170,8 @@
           <w:rFonts w:ascii="Calibri" w:cs="Calibri" w:eastAsia="Calibri" w:hAnsi="Calibri"/>
           <w:sz w:val="21"/>
           <w:szCs w:val="21"/>
-          <w:highlight w:val="yellow"/>
-          <w:highlightCs w:val="yellow"/>
-        </w:rPr>
-        <w:t xml:space="preserve">[Python, SQL, Excel / Google Sheets, Looker Studio – keep only what you use]</w:t>
+        </w:rPr>
+        <w:t xml:space="preserve">Python (Google Colab), Tableau, Microsoft Excel</w:t>
       </w:r>
     </w:p>
     <w:p>
@@ -214,25 +194,7 @@
           <w:sz w:val="21"/>
           <w:szCs w:val="21"/>
         </w:rPr>
-        <w:t xml:space="preserve">Indonesian (native), English (IELTS 6.5), Arabic (</w:t>
-      </w:r>
-      <w:r>
-        <w:rPr>
-          <w:rFonts w:ascii="Calibri" w:cs="Calibri" w:eastAsia="Calibri" w:hAnsi="Calibri"/>
-          <w:sz w:val="21"/>
-          <w:szCs w:val="21"/>
-          <w:highlight w:val="yellow"/>
-          <w:highlightCs w:val="yellow"/>
-        </w:rPr>
-        <w:t xml:space="preserve">[level]</w:t>
-      </w:r>
-      <w:r>
-        <w:rPr>
-          <w:rFonts w:ascii="Calibri" w:cs="Calibri" w:eastAsia="Calibri" w:hAnsi="Calibri"/>
-          <w:sz w:val="21"/>
-          <w:szCs w:val="21"/>
-        </w:rPr>
-        <w:t xml:space="preserve">)</w:t>
+        <w:t xml:space="preserve">Indonesian (native), English (IELTS 6.5), Arabic (conversational)</w:t>
       </w:r>
     </w:p>
     <w:p>
@@ -393,25 +355,7 @@
           <w:sz w:val="21"/>
           <w:szCs w:val="21"/>
         </w:rPr>
-        <w:t xml:space="preserve">Delivered actionable insights using </w:t>
-      </w:r>
-      <w:r>
-        <w:rPr>
-          <w:rFonts w:ascii="Calibri" w:cs="Calibri" w:eastAsia="Calibri" w:hAnsi="Calibri"/>
-          <w:sz w:val="21"/>
-          <w:szCs w:val="21"/>
-          <w:highlight w:val="yellow"/>
-          <w:highlightCs w:val="yellow"/>
-        </w:rPr>
-        <w:t xml:space="preserve">[Excel / Google Sheets / SQL / Looker Studio / Python – keep only what you used]</w:t>
-      </w:r>
-      <w:r>
-        <w:rPr>
-          <w:rFonts w:ascii="Calibri" w:cs="Calibri" w:eastAsia="Calibri" w:hAnsi="Calibri"/>
-          <w:sz w:val="21"/>
-          <w:szCs w:val="21"/>
-        </w:rPr>
-        <w:t xml:space="preserve">.</w:t>
+        <w:t xml:space="preserve">Used Python (Google Colab) and Excel for the analysis and Tableau for visualizations, delivering actionable insights.</w:t>
       </w:r>
     </w:p>
     <w:p>
@@ -489,25 +433,7 @@
           <w:sz w:val="21"/>
           <w:szCs w:val="21"/>
         </w:rPr>
-        <w:t xml:space="preserve">Designed visual content for Instagram </w:t>
-      </w:r>
-      <w:r>
-        <w:rPr>
-          <w:rFonts w:ascii="Calibri" w:cs="Calibri" w:eastAsia="Calibri" w:hAnsi="Calibri"/>
-          <w:sz w:val="21"/>
-          <w:szCs w:val="21"/>
-          <w:highlight w:val="yellow"/>
-          <w:highlightCs w:val="yellow"/>
-        </w:rPr>
-        <w:t xml:space="preserve">[and TikTok]</w:t>
-      </w:r>
-      <w:r>
-        <w:rPr>
-          <w:rFonts w:ascii="Calibri" w:cs="Calibri" w:eastAsia="Calibri" w:hAnsi="Calibri"/>
-          <w:sz w:val="21"/>
-          <w:szCs w:val="21"/>
-        </w:rPr>
-        <w:t xml:space="preserve"> using Adobe Photoshop, Canva and CapCut.</w:t>
+        <w:t xml:space="preserve">Designed visual content for the brand’s social media platforms using Adobe Photoshop, Canva and CapCut.</w:t>
       </w:r>
     </w:p>
     <w:p>
@@ -642,7 +568,7 @@
           <w:sz w:val="21"/>
           <w:szCs w:val="21"/>
         </w:rPr>
-        <w:t xml:space="preserve">Student Seminar – Event Organizer</w:t>
+        <w:t xml:space="preserve">Student Seminar – Event Organizer &amp; Designer</w:t>
       </w:r>
       <w:r>
         <w:rPr>
@@ -678,25 +604,7 @@
           <w:sz w:val="21"/>
           <w:szCs w:val="21"/>
         </w:rPr>
-        <w:t xml:space="preserve">Led the collaborative concept and theme design for the seminar </w:t>
-      </w:r>
-      <w:r>
-        <w:rPr>
-          <w:rFonts w:ascii="Calibri" w:cs="Calibri" w:eastAsia="Calibri" w:hAnsi="Calibri"/>
-          <w:sz w:val="21"/>
-          <w:szCs w:val="21"/>
-          <w:highlight w:val="yellow"/>
-          <w:highlightCs w:val="yellow"/>
-        </w:rPr>
-        <w:t xml:space="preserve">[and designed its poster and social media visuals]</w:t>
-      </w:r>
-      <w:r>
-        <w:rPr>
-          <w:rFonts w:ascii="Calibri" w:cs="Calibri" w:eastAsia="Calibri" w:hAnsi="Calibri"/>
-          <w:sz w:val="21"/>
-          <w:szCs w:val="21"/>
-        </w:rPr>
-        <w:t xml:space="preserve">.</w:t>
+        <w:t xml:space="preserve">Designed all event graphics and led the collaborative concept and theme design for the seminar.</w:t>
       </w:r>
     </w:p>
     <w:p>
@@ -777,19 +685,7 @@
           <w:sz w:val="21"/>
           <w:szCs w:val="21"/>
         </w:rPr>
-        <w:t xml:space="preserve">May 2025 – Expected </w:t>
-      </w:r>
-      <w:r>
-        <w:rPr>
-          <w:rFonts w:ascii="Calibri" w:cs="Calibri" w:eastAsia="Calibri" w:hAnsi="Calibri"/>
-          <w:i/>
-          <w:iCs/>
-          <w:sz w:val="21"/>
-          <w:szCs w:val="21"/>
-          <w:highlight w:val="yellow"/>
-          <w:highlightCs w:val="yellow"/>
-        </w:rPr>
-        <w:t xml:space="preserve">[2028]</w:t>
+        <w:t xml:space="preserve">May 2025 – Expected 2028</w:t>
       </w:r>
     </w:p>
     <w:p>
@@ -833,7 +729,7 @@
         </w:rPr>
         <w:t xml:space="preserve">  |  Tempat Belajar, Aug 2024 – Jan 2025  </w:t>
       </w:r>
-      <w:hyperlink w:history="1" r:id="rIdwny4ne8z5c6yjxrxgyjkx">
+      <w:hyperlink w:history="1" r:id="rIdajfeuhiamnxsbsa4zb3f8">
         <w:r>
           <w:rPr>
             <w:rFonts w:ascii="Calibri" w:cs="Calibri" w:eastAsia="Calibri" w:hAnsi="Calibri"/>
@@ -868,7 +764,7 @@
         </w:rPr>
         <w:t xml:space="preserve">  |  Overall Band 6.5  </w:t>
       </w:r>
-      <w:hyperlink w:history="1" r:id="rId8iuql30aw4mdordkeyrvg">
+      <w:hyperlink w:history="1" r:id="rIdjsdio6qwbn8hhz7cte2pf">
         <w:r>
           <w:rPr>
             <w:rFonts w:ascii="Calibri" w:cs="Calibri" w:eastAsia="Calibri" w:hAnsi="Calibri"/>

</xml_diff>